<commit_message>
progress with baselines and tesis plan
</commit_message>
<xml_diff>
--- a/docs/tesis/Plan_de_tesis_SSTedoldi.docx
+++ b/docs/tesis/Plan_de_tesis_SSTedoldi.docx
@@ -1206,7 +1206,7 @@
           <w:u w:val="none"/>
           <w:lang w:val="es-AR"/>
         </w:rPr>
-        <w:t>Antecedentes</w:t>
+        <w:t>Objetivos</w:t>
       </w:r>
     </w:p>
     <w:p>
@@ -1223,36 +1223,95 @@
       <w:r>
         <w:rPr>
           <w:rFonts w:ascii="Liberation Sans" w:eastAsia="Liberation Sans" w:hAnsi="Liberation Sans" w:cs="Liberation Sans"/>
-          <w:color w:val="000000"/>
-          <w:lang w:val="es-AR"/>
-        </w:rPr>
-        <w:t>Para el Taller de Tesis 1 de la Maestría, s</w:t>
-      </w:r>
-      <w:r>
-        <w:rPr>
-          <w:rFonts w:ascii="Liberation Sans" w:eastAsia="Liberation Sans" w:hAnsi="Liberation Sans" w:cs="Liberation Sans"/>
-          <w:color w:val="000000"/>
-          <w:lang w:val="es-AR"/>
-        </w:rPr>
-        <w:t xml:space="preserve">e entrenó un clasificador con </w:t>
-      </w:r>
-      <w:r>
-        <w:rPr>
-          <w:rFonts w:ascii="Liberation Sans" w:eastAsia="Liberation Sans" w:hAnsi="Liberation Sans" w:cs="Liberation Sans"/>
           <w:b/>
           <w:bCs/>
           <w:color w:val="000000"/>
           <w:lang w:val="es-AR"/>
         </w:rPr>
-        <w:t>DistilBERT</w:t>
-      </w:r>
-      <w:r>
-        <w:rPr>
-          <w:rFonts w:ascii="Liberation Sans" w:eastAsia="Liberation Sans" w:hAnsi="Liberation Sans" w:cs="Liberation Sans"/>
-          <w:color w:val="000000"/>
-          <w:lang w:val="es-AR"/>
-        </w:rPr>
-        <w:t xml:space="preserve"> (transfer learning, </w:t>
+        <w:t>Objetivo general</w:t>
+      </w:r>
+      <w:r>
+        <w:rPr>
+          <w:rFonts w:ascii="Liberation Sans" w:eastAsia="Liberation Sans" w:hAnsi="Liberation Sans" w:cs="Liberation Sans"/>
+          <w:color w:val="000000"/>
+          <w:lang w:val="es-AR"/>
+        </w:rPr>
+        <w:t>:</w:t>
+      </w:r>
+      <w:r>
+        <w:rPr>
+          <w:rFonts w:ascii="Liberation Sans" w:eastAsia="Liberation Sans" w:hAnsi="Liberation Sans" w:cs="Liberation Sans"/>
+          <w:b/>
+          <w:bCs/>
+          <w:color w:val="000000"/>
+          <w:lang w:val="es-AR"/>
+        </w:rPr>
+        <w:t xml:space="preserve"> </w:t>
+      </w:r>
+      <w:r>
+        <w:rPr>
+          <w:rFonts w:ascii="Liberation Sans" w:eastAsia="Liberation Sans" w:hAnsi="Liberation Sans" w:cs="Liberation Sans"/>
+          <w:color w:val="000000"/>
+          <w:lang w:val="es-AR"/>
+        </w:rPr>
+        <w:t>Entrenar un modelo de clasificación que logre recomendar códigos HS04 partiendo de descripciones comerciales de mercaderías.</w:t>
+      </w:r>
+    </w:p>
+    <w:p>
+      <w:pPr>
+        <w:pStyle w:val="LO-normal"/>
+        <w:spacing w:before="144" w:after="216"/>
+        <w:jc w:val="both"/>
+        <w:rPr>
+          <w:rFonts w:ascii="Liberation Sans" w:eastAsia="Liberation Sans" w:hAnsi="Liberation Sans" w:cs="Liberation Sans"/>
+          <w:color w:val="000000"/>
+          <w:lang w:val="es-AR"/>
+        </w:rPr>
+      </w:pPr>
+      <w:r>
+        <w:rPr>
+          <w:rFonts w:ascii="Liberation Sans" w:eastAsia="Liberation Sans" w:hAnsi="Liberation Sans" w:cs="Liberation Sans"/>
+          <w:b/>
+          <w:bCs/>
+          <w:color w:val="000000"/>
+          <w:lang w:val="es-AR"/>
+        </w:rPr>
+        <w:t>Objetivos específicos:</w:t>
+      </w:r>
+    </w:p>
+    <w:p>
+      <w:pPr>
+        <w:pStyle w:val="LO-normal"/>
+        <w:numPr>
+          <w:ilvl w:val="0"/>
+          <w:numId w:val="34"/>
+        </w:numPr>
+        <w:spacing w:before="144" w:after="216"/>
+        <w:jc w:val="both"/>
+        <w:rPr>
+          <w:rFonts w:ascii="Liberation Sans" w:eastAsia="Liberation Sans" w:hAnsi="Liberation Sans" w:cs="Liberation Sans"/>
+          <w:color w:val="000000"/>
+          <w:lang w:val="es-AR"/>
+        </w:rPr>
+      </w:pPr>
+      <w:r>
+        <w:rPr>
+          <w:rFonts w:ascii="Liberation Sans" w:eastAsia="Liberation Sans" w:hAnsi="Liberation Sans" w:cs="Liberation Sans"/>
+          <w:b/>
+          <w:bCs/>
+          <w:color w:val="000000"/>
+          <w:lang w:val="es-AR"/>
+        </w:rPr>
+        <w:lastRenderedPageBreak/>
+        <w:t>Preprocesamiento</w:t>
+      </w:r>
+      <w:r>
+        <w:rPr>
+          <w:rFonts w:ascii="Liberation Sans" w:eastAsia="Liberation Sans" w:hAnsi="Liberation Sans" w:cs="Liberation Sans"/>
+          <w:color w:val="000000"/>
+          <w:lang w:val="es-AR"/>
+        </w:rPr>
+        <w:t>: normalización, </w:t>
       </w:r>
       <w:r>
         <w:rPr>
@@ -1262,7 +1321,15 @@
           <w:color w:val="000000"/>
           <w:lang w:val="es-AR"/>
         </w:rPr>
-        <w:t>f</w:t>
+        <w:t>stopwords</w:t>
+      </w:r>
+      <w:r>
+        <w:rPr>
+          <w:rFonts w:ascii="Liberation Sans" w:eastAsia="Liberation Sans" w:hAnsi="Liberation Sans" w:cs="Liberation Sans"/>
+          <w:color w:val="000000"/>
+          <w:lang w:val="es-AR"/>
+        </w:rPr>
+        <w:t>, </w:t>
       </w:r>
       <w:r>
         <w:rPr>
@@ -1272,16 +1339,32 @@
           <w:color w:val="000000"/>
           <w:lang w:val="es-AR"/>
         </w:rPr>
-        <w:t>ine-tuning</w:t>
-      </w:r>
-      <w:r>
-        <w:rPr>
-          <w:rFonts w:ascii="Liberation Sans" w:eastAsia="Liberation Sans" w:hAnsi="Liberation Sans" w:cs="Liberation Sans"/>
-          <w:color w:val="000000"/>
-          <w:lang w:val="es-AR"/>
-        </w:rPr>
-        <w:t xml:space="preserve"> parcial y total) para </w:t>
-      </w:r>
+        <w:t>n-gramas</w:t>
+      </w:r>
+      <w:r>
+        <w:rPr>
+          <w:rFonts w:ascii="Liberation Sans" w:eastAsia="Liberation Sans" w:hAnsi="Liberation Sans" w:cs="Liberation Sans"/>
+          <w:color w:val="000000"/>
+          <w:lang w:val="es-AR"/>
+        </w:rPr>
+        <w:t>; medir cuándo ayudan/perjudican la clasificación.</w:t>
+      </w:r>
+    </w:p>
+    <w:p>
+      <w:pPr>
+        <w:pStyle w:val="LO-normal"/>
+        <w:numPr>
+          <w:ilvl w:val="0"/>
+          <w:numId w:val="34"/>
+        </w:numPr>
+        <w:spacing w:before="144" w:after="216"/>
+        <w:jc w:val="both"/>
+        <w:rPr>
+          <w:rFonts w:ascii="Liberation Sans" w:eastAsia="Liberation Sans" w:hAnsi="Liberation Sans" w:cs="Liberation Sans"/>
+          <w:color w:val="000000"/>
+          <w:lang w:val="es-AR"/>
+        </w:rPr>
+      </w:pPr>
       <w:r>
         <w:rPr>
           <w:rFonts w:ascii="Liberation Sans" w:eastAsia="Liberation Sans" w:hAnsi="Liberation Sans" w:cs="Liberation Sans"/>
@@ -1290,15 +1373,15 @@
           <w:color w:val="000000"/>
           <w:lang w:val="es-AR"/>
         </w:rPr>
-        <w:t>HS04</w:t>
-      </w:r>
-      <w:r>
-        <w:rPr>
-          <w:rFonts w:ascii="Liberation Sans" w:eastAsia="Liberation Sans" w:hAnsi="Liberation Sans" w:cs="Liberation Sans"/>
-          <w:color w:val="000000"/>
-          <w:lang w:val="es-AR"/>
-        </w:rPr>
-        <w:t xml:space="preserve">, obteniendo aprox. </w:t>
+        <w:t>Baselines:</w:t>
+      </w:r>
+      <w:r>
+        <w:rPr>
+          <w:rFonts w:ascii="Liberation Sans" w:eastAsia="Liberation Sans" w:hAnsi="Liberation Sans" w:cs="Liberation Sans"/>
+          <w:color w:val="000000"/>
+          <w:lang w:val="es-AR"/>
+        </w:rPr>
+        <w:t> entrenar y evaluar </w:t>
       </w:r>
       <w:r>
         <w:rPr>
@@ -1308,15 +1391,15 @@
           <w:color w:val="000000"/>
           <w:lang w:val="es-AR"/>
         </w:rPr>
-        <w:t>Top-1 ≈ 64 %</w:t>
-      </w:r>
-      <w:r>
-        <w:rPr>
-          <w:rFonts w:ascii="Liberation Sans" w:eastAsia="Liberation Sans" w:hAnsi="Liberation Sans" w:cs="Liberation Sans"/>
-          <w:color w:val="000000"/>
-          <w:lang w:val="es-AR"/>
-        </w:rPr>
-        <w:t xml:space="preserve"> y </w:t>
+        <w:t>Doc2Vec</w:t>
+      </w:r>
+      <w:r>
+        <w:rPr>
+          <w:rFonts w:ascii="Liberation Sans" w:eastAsia="Liberation Sans" w:hAnsi="Liberation Sans" w:cs="Liberation Sans"/>
+          <w:color w:val="000000"/>
+          <w:lang w:val="es-AR"/>
+        </w:rPr>
+        <w:t> y </w:t>
       </w:r>
       <w:r>
         <w:rPr>
@@ -1326,7 +1409,35 @@
           <w:color w:val="000000"/>
           <w:lang w:val="es-AR"/>
         </w:rPr>
-        <w:t>Top-5 ≈ 82 %</w:t>
+        <w:t>FastText</w:t>
+      </w:r>
+      <w:r>
+        <w:rPr>
+          <w:rFonts w:ascii="Liberation Sans" w:eastAsia="Liberation Sans" w:hAnsi="Liberation Sans" w:cs="Liberation Sans"/>
+          <w:color w:val="000000"/>
+          <w:lang w:val="es-AR"/>
+        </w:rPr>
+        <w:t> para cuantificar el valor incremental de </w:t>
+      </w:r>
+      <w:r>
+        <w:rPr>
+          <w:rFonts w:ascii="Liberation Sans" w:eastAsia="Liberation Sans" w:hAnsi="Liberation Sans" w:cs="Liberation Sans"/>
+          <w:b/>
+          <w:bCs/>
+          <w:color w:val="000000"/>
+          <w:lang w:val="es-AR"/>
+        </w:rPr>
+        <w:t>T</w:t>
+      </w:r>
+      <w:r>
+        <w:rPr>
+          <w:rFonts w:ascii="Liberation Sans" w:eastAsia="Liberation Sans" w:hAnsi="Liberation Sans" w:cs="Liberation Sans"/>
+          <w:b/>
+          <w:bCs/>
+          <w:color w:val="000000"/>
+          <w:lang w:val="es-AR"/>
+        </w:rPr>
+        <w:t>ransformers</w:t>
       </w:r>
       <w:r>
         <w:rPr>
@@ -1339,6 +1450,40 @@
     </w:p>
     <w:p>
       <w:pPr>
+        <w:pStyle w:val="LO-normal"/>
+        <w:numPr>
+          <w:ilvl w:val="0"/>
+          <w:numId w:val="34"/>
+        </w:numPr>
+        <w:spacing w:before="144" w:after="216"/>
+        <w:jc w:val="both"/>
+        <w:rPr>
+          <w:rFonts w:ascii="Liberation Sans" w:eastAsia="Liberation Sans" w:hAnsi="Liberation Sans" w:cs="Liberation Sans"/>
+          <w:color w:val="000000"/>
+          <w:lang w:val="es-AR"/>
+        </w:rPr>
+      </w:pPr>
+      <w:r>
+        <w:rPr>
+          <w:rFonts w:ascii="Liberation Sans" w:eastAsia="Liberation Sans" w:hAnsi="Liberation Sans" w:cs="Liberation Sans"/>
+          <w:b/>
+          <w:bCs/>
+          <w:color w:val="000000"/>
+          <w:lang w:val="es-AR"/>
+        </w:rPr>
+        <w:t>Análisis del error:</w:t>
+      </w:r>
+      <w:r>
+        <w:rPr>
+          <w:rFonts w:ascii="Liberation Sans" w:eastAsia="Liberation Sans" w:hAnsi="Liberation Sans" w:cs="Liberation Sans"/>
+          <w:color w:val="000000"/>
+          <w:lang w:val="es-AR"/>
+        </w:rPr>
+        <w:t> identificar patrones de confusión por capítulo/partida y casos “difíciles”.</w:t>
+      </w:r>
+    </w:p>
+    <w:p>
+      <w:pPr>
         <w:pStyle w:val="Ttulo3"/>
         <w:rPr>
           <w:u w:val="none"/>
@@ -1350,7 +1495,150 @@
           <w:u w:val="none"/>
           <w:lang w:val="es-AR"/>
         </w:rPr>
-        <w:lastRenderedPageBreak/>
+        <w:t>Antecedentes</w:t>
+      </w:r>
+    </w:p>
+    <w:p>
+      <w:pPr>
+        <w:pStyle w:val="LO-normal"/>
+        <w:spacing w:before="144" w:after="216"/>
+        <w:jc w:val="both"/>
+        <w:rPr>
+          <w:rFonts w:ascii="Liberation Sans" w:eastAsia="Liberation Sans" w:hAnsi="Liberation Sans" w:cs="Liberation Sans"/>
+          <w:color w:val="000000"/>
+          <w:lang w:val="es-AR"/>
+        </w:rPr>
+      </w:pPr>
+      <w:r>
+        <w:rPr>
+          <w:rFonts w:ascii="Liberation Sans" w:eastAsia="Liberation Sans" w:hAnsi="Liberation Sans" w:cs="Liberation Sans"/>
+          <w:color w:val="000000"/>
+          <w:lang w:val="es-AR"/>
+        </w:rPr>
+        <w:t>Para el Taller de Tesis 1 de la Maestría, s</w:t>
+      </w:r>
+      <w:r>
+        <w:rPr>
+          <w:rFonts w:ascii="Liberation Sans" w:eastAsia="Liberation Sans" w:hAnsi="Liberation Sans" w:cs="Liberation Sans"/>
+          <w:color w:val="000000"/>
+          <w:lang w:val="es-AR"/>
+        </w:rPr>
+        <w:t xml:space="preserve">e entrenó un clasificador con </w:t>
+      </w:r>
+      <w:r>
+        <w:rPr>
+          <w:rFonts w:ascii="Liberation Sans" w:eastAsia="Liberation Sans" w:hAnsi="Liberation Sans" w:cs="Liberation Sans"/>
+          <w:b/>
+          <w:bCs/>
+          <w:color w:val="000000"/>
+          <w:lang w:val="es-AR"/>
+        </w:rPr>
+        <w:t>DistilBERT</w:t>
+      </w:r>
+      <w:r>
+        <w:rPr>
+          <w:rFonts w:ascii="Liberation Sans" w:eastAsia="Liberation Sans" w:hAnsi="Liberation Sans" w:cs="Liberation Sans"/>
+          <w:color w:val="000000"/>
+          <w:lang w:val="es-AR"/>
+        </w:rPr>
+        <w:t xml:space="preserve"> (transfer learning, </w:t>
+      </w:r>
+      <w:r>
+        <w:rPr>
+          <w:rFonts w:ascii="Liberation Sans" w:eastAsia="Liberation Sans" w:hAnsi="Liberation Sans" w:cs="Liberation Sans"/>
+          <w:i/>
+          <w:iCs/>
+          <w:color w:val="000000"/>
+          <w:lang w:val="es-AR"/>
+        </w:rPr>
+        <w:t>f</w:t>
+      </w:r>
+      <w:r>
+        <w:rPr>
+          <w:rFonts w:ascii="Liberation Sans" w:eastAsia="Liberation Sans" w:hAnsi="Liberation Sans" w:cs="Liberation Sans"/>
+          <w:i/>
+          <w:iCs/>
+          <w:color w:val="000000"/>
+          <w:lang w:val="es-AR"/>
+        </w:rPr>
+        <w:t>ine-tuning</w:t>
+      </w:r>
+      <w:r>
+        <w:rPr>
+          <w:rFonts w:ascii="Liberation Sans" w:eastAsia="Liberation Sans" w:hAnsi="Liberation Sans" w:cs="Liberation Sans"/>
+          <w:color w:val="000000"/>
+          <w:lang w:val="es-AR"/>
+        </w:rPr>
+        <w:t xml:space="preserve"> parcial y total) para </w:t>
+      </w:r>
+      <w:r>
+        <w:rPr>
+          <w:rFonts w:ascii="Liberation Sans" w:eastAsia="Liberation Sans" w:hAnsi="Liberation Sans" w:cs="Liberation Sans"/>
+          <w:b/>
+          <w:bCs/>
+          <w:color w:val="000000"/>
+          <w:lang w:val="es-AR"/>
+        </w:rPr>
+        <w:t>HS04</w:t>
+      </w:r>
+      <w:r>
+        <w:rPr>
+          <w:rFonts w:ascii="Liberation Sans" w:eastAsia="Liberation Sans" w:hAnsi="Liberation Sans" w:cs="Liberation Sans"/>
+          <w:color w:val="000000"/>
+          <w:lang w:val="es-AR"/>
+        </w:rPr>
+        <w:t xml:space="preserve">, obteniendo aprox. </w:t>
+      </w:r>
+      <w:r>
+        <w:rPr>
+          <w:rFonts w:ascii="Liberation Sans" w:eastAsia="Liberation Sans" w:hAnsi="Liberation Sans" w:cs="Liberation Sans"/>
+          <w:b/>
+          <w:bCs/>
+          <w:color w:val="000000"/>
+          <w:lang w:val="es-AR"/>
+        </w:rPr>
+        <w:t>Top-1 ≈ 64 %</w:t>
+      </w:r>
+      <w:r>
+        <w:rPr>
+          <w:rFonts w:ascii="Liberation Sans" w:eastAsia="Liberation Sans" w:hAnsi="Liberation Sans" w:cs="Liberation Sans"/>
+          <w:color w:val="000000"/>
+          <w:lang w:val="es-AR"/>
+        </w:rPr>
+        <w:t xml:space="preserve"> y </w:t>
+      </w:r>
+      <w:r>
+        <w:rPr>
+          <w:rFonts w:ascii="Liberation Sans" w:eastAsia="Liberation Sans" w:hAnsi="Liberation Sans" w:cs="Liberation Sans"/>
+          <w:b/>
+          <w:bCs/>
+          <w:color w:val="000000"/>
+          <w:lang w:val="es-AR"/>
+        </w:rPr>
+        <w:t>Top-5 ≈ 82 %</w:t>
+      </w:r>
+      <w:r>
+        <w:rPr>
+          <w:rFonts w:ascii="Liberation Sans" w:eastAsia="Liberation Sans" w:hAnsi="Liberation Sans" w:cs="Liberation Sans"/>
+          <w:color w:val="000000"/>
+          <w:lang w:val="es-AR"/>
+        </w:rPr>
+        <w:t>.</w:t>
+      </w:r>
+    </w:p>
+    <w:p>
+      <w:pPr>
+        <w:pStyle w:val="Ttulo3"/>
+        <w:rPr>
+          <w:u w:val="none"/>
+          <w:lang w:val="es-AR"/>
+        </w:rPr>
+      </w:pPr>
+      <w:r>
+        <w:rPr>
+          <w:u w:val="none"/>
+          <w:lang w:val="es-AR"/>
+        </w:rPr>
         <w:t>Enfoque metodológico</w:t>
       </w:r>
     </w:p>
@@ -1991,6 +2279,7 @@
           <w:color w:val="000000"/>
           <w:lang w:val="es-AR"/>
         </w:rPr>
+        <w:lastRenderedPageBreak/>
         <w:t>análisis de confusiones</w:t>
       </w:r>
       <w:r>
@@ -2240,7 +2529,6 @@
           <w:color w:val="000000"/>
           <w:lang w:val="es-AR"/>
         </w:rPr>
-        <w:lastRenderedPageBreak/>
         <w:t>Mitigación:</w:t>
       </w:r>
       <w:r>
@@ -2824,6 +3112,7 @@
           <w:u w:val="none"/>
           <w:lang w:val="es-AR"/>
         </w:rPr>
+        <w:lastRenderedPageBreak/>
         <w:t>Consideraciones éticas y de datos</w:t>
       </w:r>
     </w:p>
@@ -3120,6 +3409,119 @@
 <file path=word/numbering.xml><?xml version="1.0" encoding="utf-8"?>
 <w:numbering xmlns:wpc="http://schemas.microsoft.com/office/word/2010/wordprocessingCanvas" xmlns:cx="http://schemas.microsoft.com/office/drawing/2014/chartex" xmlns:cx1="http://schemas.microsoft.com/office/drawing/2015/9/8/chartex" xmlns:cx2="http://schemas.microsoft.com/office/drawing/2015/10/21/chartex" xmlns:cx3="http://schemas.microsoft.com/office/drawing/2016/5/9/chartex" xmlns:cx4="http://schemas.microsoft.com/office/drawing/2016/5/10/chartex" xmlns:cx5="http://schemas.microsoft.com/office/drawing/2016/5/11/chartex" xmlns:cx6="http://schemas.microsoft.com/office/drawing/2016/5/12/chartex" xmlns:cx7="http://schemas.microsoft.com/office/drawing/2016/5/13/chartex" xmlns:cx8="http://schemas.microsoft.com/office/drawing/2016/5/14/chartex" xmlns:mc="http://schemas.openxmlformats.org/markup-compatibility/2006" xmlns:aink="http://schemas.microsoft.com/office/drawing/2016/ink" xmlns:am3d="http://schemas.microsoft.com/office/drawing/2017/model3d" xmlns:o="urn:schemas-microsoft-com:office:office" xmlns:oel="http://schemas.microsoft.com/office/2019/extlst" xmlns:r="http://schemas.openxmlformats.org/officeDocument/2006/relationships" xmlns:m="http://schemas.openxmlformats.org/officeDocument/2006/math" xmlns:v="urn:schemas-microsoft-com:vml" xmlns:wp14="http://schemas.microsoft.com/office/word/2010/wordprocessingDrawing" xmlns:wp="http://schemas.openxmlformats.org/drawingml/2006/wordprocessingDrawing" xmlns:w10="urn:schemas-microsoft-com:office:word" xmlns:w="http://schemas.openxmlformats.org/wordprocessingml/2006/main" xmlns:w14="http://schemas.microsoft.com/office/word/2010/wordml" xmlns:w15="http://schemas.microsoft.com/office/word/2012/wordml" xmlns:w16cex="http://schemas.microsoft.com/office/word/2018/wordml/cex" xmlns:w16cid="http://schemas.microsoft.com/office/word/2016/wordml/cid" xmlns:w16="http://schemas.microsoft.com/office/word/2018/wordml" xmlns:w16du="http://schemas.microsoft.com/office/word/2023/wordml/word16du" xmlns:w16sdtdh="http://schemas.microsoft.com/office/word/2020/wordml/sdtdatahash" xmlns:w16sdtfl="http://schemas.microsoft.com/office/word/2024/wordml/sdtformatlock" xmlns:w16se="http://schemas.microsoft.com/office/word/2015/wordml/symex" xmlns:wpg="http://schemas.microsoft.com/office/word/2010/wordprocessingGroup" xmlns:wpi="http://schemas.microsoft.com/office/word/2010/wordprocessingInk" xmlns:wne="http://schemas.microsoft.com/office/word/2006/wordml" xmlns:wps="http://schemas.microsoft.com/office/word/2010/wordprocessingShape" mc:Ignorable="w14 w15 w16se w16cid w16 w16cex w16sdtdh w16sdtfl w16du wp14">
   <w:abstractNum w:abstractNumId="0" w15:restartNumberingAfterBreak="0">
+    <w:nsid w:val="0687277E"/>
+    <w:multiLevelType w:val="multilevel"/>
+    <w:tmpl w:val="AC048084"/>
+    <w:lvl w:ilvl="0">
+      <w:start w:val="1"/>
+      <w:numFmt w:val="decimal"/>
+      <w:lvlText w:val="%1."/>
+      <w:lvlJc w:val="left"/>
+      <w:pPr>
+        <w:tabs>
+          <w:tab w:val="num" w:pos="720"/>
+        </w:tabs>
+        <w:ind w:left="720" w:hanging="360"/>
+      </w:pPr>
+    </w:lvl>
+    <w:lvl w:ilvl="1" w:tentative="1">
+      <w:start w:val="1"/>
+      <w:numFmt w:val="decimal"/>
+      <w:lvlText w:val="%2."/>
+      <w:lvlJc w:val="left"/>
+      <w:pPr>
+        <w:tabs>
+          <w:tab w:val="num" w:pos="1440"/>
+        </w:tabs>
+        <w:ind w:left="1440" w:hanging="360"/>
+      </w:pPr>
+    </w:lvl>
+    <w:lvl w:ilvl="2" w:tentative="1">
+      <w:start w:val="1"/>
+      <w:numFmt w:val="decimal"/>
+      <w:lvlText w:val="%3."/>
+      <w:lvlJc w:val="left"/>
+      <w:pPr>
+        <w:tabs>
+          <w:tab w:val="num" w:pos="2160"/>
+        </w:tabs>
+        <w:ind w:left="2160" w:hanging="360"/>
+      </w:pPr>
+    </w:lvl>
+    <w:lvl w:ilvl="3" w:tentative="1">
+      <w:start w:val="1"/>
+      <w:numFmt w:val="decimal"/>
+      <w:lvlText w:val="%4."/>
+      <w:lvlJc w:val="left"/>
+      <w:pPr>
+        <w:tabs>
+          <w:tab w:val="num" w:pos="2880"/>
+        </w:tabs>
+        <w:ind w:left="2880" w:hanging="360"/>
+      </w:pPr>
+    </w:lvl>
+    <w:lvl w:ilvl="4" w:tentative="1">
+      <w:start w:val="1"/>
+      <w:numFmt w:val="decimal"/>
+      <w:lvlText w:val="%5."/>
+      <w:lvlJc w:val="left"/>
+      <w:pPr>
+        <w:tabs>
+          <w:tab w:val="num" w:pos="3600"/>
+        </w:tabs>
+        <w:ind w:left="3600" w:hanging="360"/>
+      </w:pPr>
+    </w:lvl>
+    <w:lvl w:ilvl="5" w:tentative="1">
+      <w:start w:val="1"/>
+      <w:numFmt w:val="decimal"/>
+      <w:lvlText w:val="%6."/>
+      <w:lvlJc w:val="left"/>
+      <w:pPr>
+        <w:tabs>
+          <w:tab w:val="num" w:pos="4320"/>
+        </w:tabs>
+        <w:ind w:left="4320" w:hanging="360"/>
+      </w:pPr>
+    </w:lvl>
+    <w:lvl w:ilvl="6" w:tentative="1">
+      <w:start w:val="1"/>
+      <w:numFmt w:val="decimal"/>
+      <w:lvlText w:val="%7."/>
+      <w:lvlJc w:val="left"/>
+      <w:pPr>
+        <w:tabs>
+          <w:tab w:val="num" w:pos="5040"/>
+        </w:tabs>
+        <w:ind w:left="5040" w:hanging="360"/>
+      </w:pPr>
+    </w:lvl>
+    <w:lvl w:ilvl="7" w:tentative="1">
+      <w:start w:val="1"/>
+      <w:numFmt w:val="decimal"/>
+      <w:lvlText w:val="%8."/>
+      <w:lvlJc w:val="left"/>
+      <w:pPr>
+        <w:tabs>
+          <w:tab w:val="num" w:pos="5760"/>
+        </w:tabs>
+        <w:ind w:left="5760" w:hanging="360"/>
+      </w:pPr>
+    </w:lvl>
+    <w:lvl w:ilvl="8" w:tentative="1">
+      <w:start w:val="1"/>
+      <w:numFmt w:val="decimal"/>
+      <w:lvlText w:val="%9."/>
+      <w:lvlJc w:val="left"/>
+      <w:pPr>
+        <w:tabs>
+          <w:tab w:val="num" w:pos="6480"/>
+        </w:tabs>
+        <w:ind w:left="6480" w:hanging="360"/>
+      </w:pPr>
+    </w:lvl>
+  </w:abstractNum>
+  <w:abstractNum w:abstractNumId="1" w15:restartNumberingAfterBreak="0">
     <w:nsid w:val="09B9346B"/>
     <w:multiLevelType w:val="multilevel"/>
     <w:tmpl w:val="3EC221F8"/>
@@ -3232,7 +3634,7 @@
       </w:pPr>
     </w:lvl>
   </w:abstractNum>
-  <w:abstractNum w:abstractNumId="1" w15:restartNumberingAfterBreak="0">
+  <w:abstractNum w:abstractNumId="2" w15:restartNumberingAfterBreak="0">
     <w:nsid w:val="0E590CD6"/>
     <w:multiLevelType w:val="multilevel"/>
     <w:tmpl w:val="1E3C63D6"/>
@@ -3381,7 +3783,7 @@
       </w:rPr>
     </w:lvl>
   </w:abstractNum>
-  <w:abstractNum w:abstractNumId="2" w15:restartNumberingAfterBreak="0">
+  <w:abstractNum w:abstractNumId="3" w15:restartNumberingAfterBreak="0">
     <w:nsid w:val="0E9A65BC"/>
     <w:multiLevelType w:val="multilevel"/>
     <w:tmpl w:val="719858AE"/>
@@ -3494,7 +3896,7 @@
       </w:pPr>
     </w:lvl>
   </w:abstractNum>
-  <w:abstractNum w:abstractNumId="3" w15:restartNumberingAfterBreak="0">
+  <w:abstractNum w:abstractNumId="4" w15:restartNumberingAfterBreak="0">
     <w:nsid w:val="11466681"/>
     <w:multiLevelType w:val="multilevel"/>
     <w:tmpl w:val="499EC286"/>
@@ -3643,7 +4045,7 @@
       </w:rPr>
     </w:lvl>
   </w:abstractNum>
-  <w:abstractNum w:abstractNumId="4" w15:restartNumberingAfterBreak="0">
+  <w:abstractNum w:abstractNumId="5" w15:restartNumberingAfterBreak="0">
     <w:nsid w:val="1275438C"/>
     <w:multiLevelType w:val="multilevel"/>
     <w:tmpl w:val="351E35B4"/>
@@ -3792,7 +4194,7 @@
       </w:rPr>
     </w:lvl>
   </w:abstractNum>
-  <w:abstractNum w:abstractNumId="5" w15:restartNumberingAfterBreak="0">
+  <w:abstractNum w:abstractNumId="6" w15:restartNumberingAfterBreak="0">
     <w:nsid w:val="15B33606"/>
     <w:multiLevelType w:val="multilevel"/>
     <w:tmpl w:val="902EB06A"/>
@@ -3932,7 +4334,7 @@
       </w:rPr>
     </w:lvl>
   </w:abstractNum>
-  <w:abstractNum w:abstractNumId="6" w15:restartNumberingAfterBreak="0">
+  <w:abstractNum w:abstractNumId="7" w15:restartNumberingAfterBreak="0">
     <w:nsid w:val="1B530643"/>
     <w:multiLevelType w:val="multilevel"/>
     <w:tmpl w:val="D51C1B52"/>
@@ -4045,7 +4447,7 @@
       </w:pPr>
     </w:lvl>
   </w:abstractNum>
-  <w:abstractNum w:abstractNumId="7" w15:restartNumberingAfterBreak="0">
+  <w:abstractNum w:abstractNumId="8" w15:restartNumberingAfterBreak="0">
     <w:nsid w:val="1F8A1912"/>
     <w:multiLevelType w:val="multilevel"/>
     <w:tmpl w:val="0F88448E"/>
@@ -4194,7 +4596,7 @@
       </w:rPr>
     </w:lvl>
   </w:abstractNum>
-  <w:abstractNum w:abstractNumId="8" w15:restartNumberingAfterBreak="0">
+  <w:abstractNum w:abstractNumId="9" w15:restartNumberingAfterBreak="0">
     <w:nsid w:val="2260642D"/>
     <w:multiLevelType w:val="hybridMultilevel"/>
     <w:tmpl w:val="D6B45560"/>
@@ -4307,7 +4709,7 @@
       </w:rPr>
     </w:lvl>
   </w:abstractNum>
-  <w:abstractNum w:abstractNumId="9" w15:restartNumberingAfterBreak="0">
+  <w:abstractNum w:abstractNumId="10" w15:restartNumberingAfterBreak="0">
     <w:nsid w:val="2A0A6F20"/>
     <w:multiLevelType w:val="multilevel"/>
     <w:tmpl w:val="C9068BA8"/>
@@ -4456,7 +4858,7 @@
       </w:rPr>
     </w:lvl>
   </w:abstractNum>
-  <w:abstractNum w:abstractNumId="10" w15:restartNumberingAfterBreak="0">
+  <w:abstractNum w:abstractNumId="11" w15:restartNumberingAfterBreak="0">
     <w:nsid w:val="2CEC24F9"/>
     <w:multiLevelType w:val="multilevel"/>
     <w:tmpl w:val="615EBAE4"/>
@@ -4605,7 +5007,7 @@
       </w:rPr>
     </w:lvl>
   </w:abstractNum>
-  <w:abstractNum w:abstractNumId="11" w15:restartNumberingAfterBreak="0">
+  <w:abstractNum w:abstractNumId="12" w15:restartNumberingAfterBreak="0">
     <w:nsid w:val="2F8959B7"/>
     <w:multiLevelType w:val="multilevel"/>
     <w:tmpl w:val="2C88D446"/>
@@ -4754,7 +5156,7 @@
       </w:rPr>
     </w:lvl>
   </w:abstractNum>
-  <w:abstractNum w:abstractNumId="12" w15:restartNumberingAfterBreak="0">
+  <w:abstractNum w:abstractNumId="13" w15:restartNumberingAfterBreak="0">
     <w:nsid w:val="33AE4E22"/>
     <w:multiLevelType w:val="multilevel"/>
     <w:tmpl w:val="6726B6E2"/>
@@ -4903,7 +5305,7 @@
       </w:rPr>
     </w:lvl>
   </w:abstractNum>
-  <w:abstractNum w:abstractNumId="13" w15:restartNumberingAfterBreak="0">
+  <w:abstractNum w:abstractNumId="14" w15:restartNumberingAfterBreak="0">
     <w:nsid w:val="3799310A"/>
     <w:multiLevelType w:val="multilevel"/>
     <w:tmpl w:val="1598ACC6"/>
@@ -5020,7 +5422,7 @@
       </w:pPr>
     </w:lvl>
   </w:abstractNum>
-  <w:abstractNum w:abstractNumId="14" w15:restartNumberingAfterBreak="0">
+  <w:abstractNum w:abstractNumId="15" w15:restartNumberingAfterBreak="0">
     <w:nsid w:val="3895740C"/>
     <w:multiLevelType w:val="multilevel"/>
     <w:tmpl w:val="61321A1E"/>
@@ -5169,7 +5571,7 @@
       </w:rPr>
     </w:lvl>
   </w:abstractNum>
-  <w:abstractNum w:abstractNumId="15" w15:restartNumberingAfterBreak="0">
+  <w:abstractNum w:abstractNumId="16" w15:restartNumberingAfterBreak="0">
     <w:nsid w:val="3920399E"/>
     <w:multiLevelType w:val="multilevel"/>
     <w:tmpl w:val="2934F4B8"/>
@@ -5318,7 +5720,7 @@
       </w:rPr>
     </w:lvl>
   </w:abstractNum>
-  <w:abstractNum w:abstractNumId="16" w15:restartNumberingAfterBreak="0">
+  <w:abstractNum w:abstractNumId="17" w15:restartNumberingAfterBreak="0">
     <w:nsid w:val="3B457D92"/>
     <w:multiLevelType w:val="multilevel"/>
     <w:tmpl w:val="5E8A3B6A"/>
@@ -5467,7 +5869,7 @@
       </w:rPr>
     </w:lvl>
   </w:abstractNum>
-  <w:abstractNum w:abstractNumId="17" w15:restartNumberingAfterBreak="0">
+  <w:abstractNum w:abstractNumId="18" w15:restartNumberingAfterBreak="0">
     <w:nsid w:val="3E0926A5"/>
     <w:multiLevelType w:val="multilevel"/>
     <w:tmpl w:val="853A8A5A"/>
@@ -5616,7 +6018,7 @@
       </w:rPr>
     </w:lvl>
   </w:abstractNum>
-  <w:abstractNum w:abstractNumId="18" w15:restartNumberingAfterBreak="0">
+  <w:abstractNum w:abstractNumId="19" w15:restartNumberingAfterBreak="0">
     <w:nsid w:val="4E316748"/>
     <w:multiLevelType w:val="multilevel"/>
     <w:tmpl w:val="1186ACB4"/>
@@ -5765,7 +6167,7 @@
       </w:rPr>
     </w:lvl>
   </w:abstractNum>
-  <w:abstractNum w:abstractNumId="19" w15:restartNumberingAfterBreak="0">
+  <w:abstractNum w:abstractNumId="20" w15:restartNumberingAfterBreak="0">
     <w:nsid w:val="4FB811B4"/>
     <w:multiLevelType w:val="multilevel"/>
     <w:tmpl w:val="A080EEDA"/>
@@ -5878,7 +6280,7 @@
       </w:pPr>
     </w:lvl>
   </w:abstractNum>
-  <w:abstractNum w:abstractNumId="20" w15:restartNumberingAfterBreak="0">
+  <w:abstractNum w:abstractNumId="21" w15:restartNumberingAfterBreak="0">
     <w:nsid w:val="59974C45"/>
     <w:multiLevelType w:val="multilevel"/>
     <w:tmpl w:val="93D0266A"/>
@@ -6027,7 +6429,7 @@
       </w:rPr>
     </w:lvl>
   </w:abstractNum>
-  <w:abstractNum w:abstractNumId="21" w15:restartNumberingAfterBreak="0">
+  <w:abstractNum w:abstractNumId="22" w15:restartNumberingAfterBreak="0">
     <w:nsid w:val="5C0A23E4"/>
     <w:multiLevelType w:val="multilevel"/>
     <w:tmpl w:val="556A5C1C"/>
@@ -6176,7 +6578,7 @@
       </w:rPr>
     </w:lvl>
   </w:abstractNum>
-  <w:abstractNum w:abstractNumId="22" w15:restartNumberingAfterBreak="0">
+  <w:abstractNum w:abstractNumId="23" w15:restartNumberingAfterBreak="0">
     <w:nsid w:val="5CCC4C66"/>
     <w:multiLevelType w:val="hybridMultilevel"/>
     <w:tmpl w:val="4BEE4824"/>
@@ -6289,7 +6691,7 @@
       </w:rPr>
     </w:lvl>
   </w:abstractNum>
-  <w:abstractNum w:abstractNumId="23" w15:restartNumberingAfterBreak="0">
+  <w:abstractNum w:abstractNumId="24" w15:restartNumberingAfterBreak="0">
     <w:nsid w:val="5FA46F1E"/>
     <w:multiLevelType w:val="multilevel"/>
     <w:tmpl w:val="37668CBC"/>
@@ -6438,7 +6840,7 @@
       </w:rPr>
     </w:lvl>
   </w:abstractNum>
-  <w:abstractNum w:abstractNumId="24" w15:restartNumberingAfterBreak="0">
+  <w:abstractNum w:abstractNumId="25" w15:restartNumberingAfterBreak="0">
     <w:nsid w:val="6134553C"/>
     <w:multiLevelType w:val="multilevel"/>
     <w:tmpl w:val="58E25A98"/>
@@ -6551,7 +6953,7 @@
       </w:pPr>
     </w:lvl>
   </w:abstractNum>
-  <w:abstractNum w:abstractNumId="25" w15:restartNumberingAfterBreak="0">
+  <w:abstractNum w:abstractNumId="26" w15:restartNumberingAfterBreak="0">
     <w:nsid w:val="639814C3"/>
     <w:multiLevelType w:val="multilevel"/>
     <w:tmpl w:val="55B6B1AC"/>
@@ -6664,7 +7066,7 @@
       </w:pPr>
     </w:lvl>
   </w:abstractNum>
-  <w:abstractNum w:abstractNumId="26" w15:restartNumberingAfterBreak="0">
+  <w:abstractNum w:abstractNumId="27" w15:restartNumberingAfterBreak="0">
     <w:nsid w:val="6AB60A04"/>
     <w:multiLevelType w:val="multilevel"/>
     <w:tmpl w:val="DB667190"/>
@@ -6813,7 +7215,7 @@
       </w:rPr>
     </w:lvl>
   </w:abstractNum>
-  <w:abstractNum w:abstractNumId="27" w15:restartNumberingAfterBreak="0">
+  <w:abstractNum w:abstractNumId="28" w15:restartNumberingAfterBreak="0">
     <w:nsid w:val="6B572E70"/>
     <w:multiLevelType w:val="multilevel"/>
     <w:tmpl w:val="7A9A0866"/>
@@ -6962,7 +7364,7 @@
       </w:rPr>
     </w:lvl>
   </w:abstractNum>
-  <w:abstractNum w:abstractNumId="28" w15:restartNumberingAfterBreak="0">
+  <w:abstractNum w:abstractNumId="29" w15:restartNumberingAfterBreak="0">
     <w:nsid w:val="70431259"/>
     <w:multiLevelType w:val="multilevel"/>
     <w:tmpl w:val="417A73A8"/>
@@ -7075,7 +7477,7 @@
       </w:pPr>
     </w:lvl>
   </w:abstractNum>
-  <w:abstractNum w:abstractNumId="29" w15:restartNumberingAfterBreak="0">
+  <w:abstractNum w:abstractNumId="30" w15:restartNumberingAfterBreak="0">
     <w:nsid w:val="71C90049"/>
     <w:multiLevelType w:val="multilevel"/>
     <w:tmpl w:val="4802F670"/>
@@ -7197,7 +7599,7 @@
       </w:pPr>
     </w:lvl>
   </w:abstractNum>
-  <w:abstractNum w:abstractNumId="30" w15:restartNumberingAfterBreak="0">
+  <w:abstractNum w:abstractNumId="31" w15:restartNumberingAfterBreak="0">
     <w:nsid w:val="780C3492"/>
     <w:multiLevelType w:val="multilevel"/>
     <w:tmpl w:val="1CBCA822"/>
@@ -7346,7 +7748,7 @@
       </w:rPr>
     </w:lvl>
   </w:abstractNum>
-  <w:abstractNum w:abstractNumId="31" w15:restartNumberingAfterBreak="0">
+  <w:abstractNum w:abstractNumId="32" w15:restartNumberingAfterBreak="0">
     <w:nsid w:val="7BF36CD6"/>
     <w:multiLevelType w:val="multilevel"/>
     <w:tmpl w:val="2B18AF20"/>
@@ -7495,7 +7897,7 @@
       </w:rPr>
     </w:lvl>
   </w:abstractNum>
-  <w:abstractNum w:abstractNumId="32" w15:restartNumberingAfterBreak="0">
+  <w:abstractNum w:abstractNumId="33" w15:restartNumberingAfterBreak="0">
     <w:nsid w:val="7EBC3BC4"/>
     <w:multiLevelType w:val="multilevel"/>
     <w:tmpl w:val="286614DC"/>
@@ -7645,103 +8047,106 @@
     </w:lvl>
   </w:abstractNum>
   <w:num w:numId="1" w16cid:durableId="1381057154">
+    <w:abstractNumId w:val="2"/>
+  </w:num>
+  <w:num w:numId="2" w16cid:durableId="773478826">
+    <w:abstractNumId w:val="16"/>
+  </w:num>
+  <w:num w:numId="3" w16cid:durableId="1209951665">
+    <w:abstractNumId w:val="31"/>
+  </w:num>
+  <w:num w:numId="4" w16cid:durableId="13579435">
+    <w:abstractNumId w:val="10"/>
+  </w:num>
+  <w:num w:numId="5" w16cid:durableId="1531257705">
+    <w:abstractNumId w:val="21"/>
+  </w:num>
+  <w:num w:numId="6" w16cid:durableId="456533421">
+    <w:abstractNumId w:val="8"/>
+  </w:num>
+  <w:num w:numId="7" w16cid:durableId="694039490">
+    <w:abstractNumId w:val="7"/>
+  </w:num>
+  <w:num w:numId="8" w16cid:durableId="1122503291">
+    <w:abstractNumId w:val="6"/>
+  </w:num>
+  <w:num w:numId="9" w16cid:durableId="364798079">
+    <w:abstractNumId w:val="15"/>
+  </w:num>
+  <w:num w:numId="10" w16cid:durableId="75632224">
+    <w:abstractNumId w:val="33"/>
+  </w:num>
+  <w:num w:numId="11" w16cid:durableId="1265961311">
+    <w:abstractNumId w:val="19"/>
+  </w:num>
+  <w:num w:numId="12" w16cid:durableId="760562766">
+    <w:abstractNumId w:val="30"/>
+  </w:num>
+  <w:num w:numId="13" w16cid:durableId="402459688">
+    <w:abstractNumId w:val="12"/>
+  </w:num>
+  <w:num w:numId="14" w16cid:durableId="673844570">
+    <w:abstractNumId w:val="23"/>
+  </w:num>
+  <w:num w:numId="15" w16cid:durableId="454252426">
+    <w:abstractNumId w:val="9"/>
+  </w:num>
+  <w:num w:numId="16" w16cid:durableId="51774145">
+    <w:abstractNumId w:val="4"/>
+  </w:num>
+  <w:num w:numId="17" w16cid:durableId="414396674">
+    <w:abstractNumId w:val="18"/>
+  </w:num>
+  <w:num w:numId="18" w16cid:durableId="48236795">
+    <w:abstractNumId w:val="22"/>
+  </w:num>
+  <w:num w:numId="19" w16cid:durableId="1366516929">
+    <w:abstractNumId w:val="17"/>
+  </w:num>
+  <w:num w:numId="20" w16cid:durableId="11222538">
+    <w:abstractNumId w:val="32"/>
+  </w:num>
+  <w:num w:numId="21" w16cid:durableId="1958485231">
+    <w:abstractNumId w:val="25"/>
+  </w:num>
+  <w:num w:numId="22" w16cid:durableId="656879562">
+    <w:abstractNumId w:val="11"/>
+  </w:num>
+  <w:num w:numId="23" w16cid:durableId="1190415914">
     <w:abstractNumId w:val="1"/>
   </w:num>
-  <w:num w:numId="2" w16cid:durableId="773478826">
-    <w:abstractNumId w:val="15"/>
+  <w:num w:numId="24" w16cid:durableId="1317032473">
+    <w:abstractNumId w:val="24"/>
   </w:num>
-  <w:num w:numId="3" w16cid:durableId="1209951665">
-    <w:abstractNumId w:val="30"/>
-  </w:num>
-  <w:num w:numId="4" w16cid:durableId="13579435">
-    <w:abstractNumId w:val="9"/>
-  </w:num>
-  <w:num w:numId="5" w16cid:durableId="1531257705">
+  <w:num w:numId="25" w16cid:durableId="1600676786">
     <w:abstractNumId w:val="20"/>
   </w:num>
-  <w:num w:numId="6" w16cid:durableId="456533421">
-    <w:abstractNumId w:val="7"/>
+  <w:num w:numId="26" w16cid:durableId="168906813">
+    <w:abstractNumId w:val="27"/>
   </w:num>
-  <w:num w:numId="7" w16cid:durableId="694039490">
-    <w:abstractNumId w:val="6"/>
+  <w:num w:numId="27" w16cid:durableId="1276712841">
+    <w:abstractNumId w:val="29"/>
   </w:num>
-  <w:num w:numId="8" w16cid:durableId="1122503291">
+  <w:num w:numId="28" w16cid:durableId="1554005499">
     <w:abstractNumId w:val="5"/>
   </w:num>
-  <w:num w:numId="9" w16cid:durableId="364798079">
+  <w:num w:numId="29" w16cid:durableId="968323420">
+    <w:abstractNumId w:val="3"/>
+  </w:num>
+  <w:num w:numId="30" w16cid:durableId="1156916685">
+    <w:abstractNumId w:val="13"/>
+  </w:num>
+  <w:num w:numId="31" w16cid:durableId="1184053764">
+    <w:abstractNumId w:val="26"/>
+  </w:num>
+  <w:num w:numId="32" w16cid:durableId="1324818922">
+    <w:abstractNumId w:val="28"/>
+  </w:num>
+  <w:num w:numId="33" w16cid:durableId="1796369814">
     <w:abstractNumId w:val="14"/>
   </w:num>
-  <w:num w:numId="10" w16cid:durableId="75632224">
-    <w:abstractNumId w:val="32"/>
-  </w:num>
-  <w:num w:numId="11" w16cid:durableId="1265961311">
-    <w:abstractNumId w:val="18"/>
-  </w:num>
-  <w:num w:numId="12" w16cid:durableId="760562766">
-    <w:abstractNumId w:val="29"/>
-  </w:num>
-  <w:num w:numId="13" w16cid:durableId="402459688">
-    <w:abstractNumId w:val="11"/>
-  </w:num>
-  <w:num w:numId="14" w16cid:durableId="673844570">
-    <w:abstractNumId w:val="22"/>
-  </w:num>
-  <w:num w:numId="15" w16cid:durableId="454252426">
-    <w:abstractNumId w:val="8"/>
-  </w:num>
-  <w:num w:numId="16" w16cid:durableId="51774145">
-    <w:abstractNumId w:val="3"/>
-  </w:num>
-  <w:num w:numId="17" w16cid:durableId="414396674">
-    <w:abstractNumId w:val="17"/>
-  </w:num>
-  <w:num w:numId="18" w16cid:durableId="48236795">
-    <w:abstractNumId w:val="21"/>
-  </w:num>
-  <w:num w:numId="19" w16cid:durableId="1366516929">
-    <w:abstractNumId w:val="16"/>
-  </w:num>
-  <w:num w:numId="20" w16cid:durableId="11222538">
-    <w:abstractNumId w:val="31"/>
-  </w:num>
-  <w:num w:numId="21" w16cid:durableId="1958485231">
-    <w:abstractNumId w:val="24"/>
-  </w:num>
-  <w:num w:numId="22" w16cid:durableId="656879562">
-    <w:abstractNumId w:val="10"/>
-  </w:num>
-  <w:num w:numId="23" w16cid:durableId="1190415914">
+  <w:num w:numId="34" w16cid:durableId="1848137307">
     <w:abstractNumId w:val="0"/>
-  </w:num>
-  <w:num w:numId="24" w16cid:durableId="1317032473">
-    <w:abstractNumId w:val="23"/>
-  </w:num>
-  <w:num w:numId="25" w16cid:durableId="1600676786">
-    <w:abstractNumId w:val="19"/>
-  </w:num>
-  <w:num w:numId="26" w16cid:durableId="168906813">
-    <w:abstractNumId w:val="26"/>
-  </w:num>
-  <w:num w:numId="27" w16cid:durableId="1276712841">
-    <w:abstractNumId w:val="28"/>
-  </w:num>
-  <w:num w:numId="28" w16cid:durableId="1554005499">
-    <w:abstractNumId w:val="4"/>
-  </w:num>
-  <w:num w:numId="29" w16cid:durableId="968323420">
-    <w:abstractNumId w:val="2"/>
-  </w:num>
-  <w:num w:numId="30" w16cid:durableId="1156916685">
-    <w:abstractNumId w:val="12"/>
-  </w:num>
-  <w:num w:numId="31" w16cid:durableId="1184053764">
-    <w:abstractNumId w:val="25"/>
-  </w:num>
-  <w:num w:numId="32" w16cid:durableId="1324818922">
-    <w:abstractNumId w:val="27"/>
-  </w:num>
-  <w:num w:numId="33" w16cid:durableId="1796369814">
-    <w:abstractNumId w:val="13"/>
   </w:num>
 </w:numbering>
 </file>
@@ -8266,7 +8671,6 @@
   <w:style w:type="character" w:default="1" w:styleId="Fuentedeprrafopredeter">
     <w:name w:val="Default Paragraph Font"/>
     <w:uiPriority w:val="1"/>
-    <w:semiHidden/>
     <w:unhideWhenUsed/>
   </w:style>
   <w:style w:type="table" w:default="1" w:styleId="Tablanormal">

</xml_diff>